<commit_message>
Resume: analytics proof point, softened attribution, skills reorg
- summary: 'contributed to' instead of 'generated'; analytics framed as developing
- Xanderia: add the 272 record audit and the RM767,100 understatement
- SWR: seven stage financing workflow (was pipeline); restore PDPA-compliant submission
- Susano: drop the bullet that reported no outcome
- skills: five named categories plus Languages
- bump resume cache buster to 20260920c
</commit_message>
<xml_diff>
--- a/assets/Muhd-Hassan-Resume.docx
+++ b/assets/Muhd-Hassan-Resume.docx
@@ -103,7 +103,7 @@
           <w:color w:val="12212E"/>
           <w:sz w:val="19"/>
         </w:rPr>
-        <w:t xml:space="preserve"> across content and performance marketing, focused on paid social and lead generation. Runs Meta and TikTok campaigns end to end, with </w:t>
+        <w:t xml:space="preserve"> running paid social campaigns for financing products. I plan and manage Meta and TikTok advertising end to end, and my strongest areas are lead generation and performance marketing: </w:t>
       </w:r>
       <w:r>
         <w:rPr>
@@ -123,7 +123,7 @@
           <w:color w:val="12212E"/>
           <w:sz w:val="19"/>
         </w:rPr>
-        <w:t xml:space="preserve"> in ad spend behind campaigns that generated </w:t>
+        <w:t xml:space="preserve"> in ad spend behind campaigns that contributed to </w:t>
       </w:r>
       <w:r>
         <w:rPr>
@@ -163,7 +163,7 @@
           <w:color w:val="12212E"/>
           <w:sz w:val="19"/>
         </w:rPr>
-        <w:t xml:space="preserve"> in disbursed loans. Also designed the customer journey and front end of a live financing platform, and is now building marketing analytics capability through PeopleCert Data Science certifications.</w:t>
+        <w:t xml:space="preserve"> in disbursed loans. I also designed the customer journey and front end of a live financing platform, and I am developing marketing analytics skills through PeopleCert Data Science certifications.</w:t>
       </w:r>
     </w:p>
     <w:p>
@@ -257,7 +257,7 @@
           <w:color w:val="12212E"/>
           <w:sz w:val="19"/>
         </w:rPr>
-        <w:t>Plan and manage Meta and TikTok ad campaigns end to end: planning, audience targeting, creative direction and lead acquisition.</w:t>
+        <w:t>Plan and manage Meta and TikTok campaigns end to end, covering audience targeting, creative direction and lead acquisition.</w:t>
       </w:r>
     </w:p>
     <w:p>
@@ -293,7 +293,7 @@
           <w:color w:val="12212E"/>
           <w:sz w:val="19"/>
         </w:rPr>
-        <w:t>seven-stage financing pipeline</w:t>
+        <w:t>seven-stage financing workflow</w:t>
       </w:r>
       <w:r>
         <w:rPr>
@@ -303,7 +303,7 @@
           <w:color w:val="12212E"/>
           <w:sz w:val="19"/>
         </w:rPr>
-        <w:t xml:space="preserve"> (Semakan Awal through Disbursed) that agents and customers now work from.</w:t>
+        <w:t xml:space="preserve"> and the customer journey for a live financing platform, now used by agents and customers day to day.</w:t>
       </w:r>
     </w:p>
     <w:p>
@@ -329,7 +329,7 @@
           <w:color w:val="12212E"/>
           <w:sz w:val="19"/>
         </w:rPr>
-        <w:t xml:space="preserve">Designed the customer journey and built the </w:t>
+        <w:t xml:space="preserve">Designed the </w:t>
       </w:r>
       <w:r>
         <w:rPr>
@@ -349,7 +349,7 @@
           <w:color w:val="12212E"/>
           <w:sz w:val="19"/>
         </w:rPr>
-        <w:t xml:space="preserve"> for both sides of the platform: the customer application site (eligibility check, document upload, status tracking, PDPA-compliant submission) and the agent portal (case queue, document checklists, offer calculator, activity history).</w:t>
+        <w:t xml:space="preserve"> experience for the customer application site and the agent portal, including the PDPA-compliant submission flow, working with the back-end team to implement it.</w:t>
       </w:r>
     </w:p>
     <w:p>
@@ -375,33 +375,7 @@
           <w:color w:val="12212E"/>
           <w:sz w:val="19"/>
         </w:rPr>
-        <w:t>Worked with the back-end team on developing the portal, translating the financing workflow into a working system.</w:t>
-      </w:r>
-    </w:p>
-    <w:p>
-      <w:pPr>
-        <w:spacing w:before="0" w:after="24" w:line="240" w:lineRule="auto"/>
-        <w:ind w:left="283" w:hanging="181"/>
-      </w:pPr>
-      <w:r>
-        <w:rPr>
-          <w:rFonts w:ascii="Calibri" w:hAnsi="Calibri" w:eastAsia="Calibri" w:cs="Calibri"/>
-          <w:b w:val="0"/>
-          <w:i w:val="0"/>
-          <w:color w:val="12212E"/>
-          <w:sz w:val="19"/>
-        </w:rPr>
-        <w:t xml:space="preserve">• </w:t>
-      </w:r>
-      <w:r>
-        <w:rPr>
-          <w:rFonts w:ascii="Calibri" w:hAnsi="Calibri" w:eastAsia="Calibri" w:cs="Calibri"/>
-          <w:b w:val="0"/>
-          <w:i w:val="0"/>
-          <w:color w:val="12212E"/>
-          <w:sz w:val="19"/>
-        </w:rPr>
-        <w:t>Work across marketing, sales and technology to improve lead handling and shorten the time from enquiry to disbursement.</w:t>
+        <w:t>Work across marketing, sales and technology to improve how leads are handled and followed up.</w:t>
       </w:r>
     </w:p>
     <w:p>
@@ -507,7 +481,7 @@
           <w:color w:val="12212E"/>
           <w:sz w:val="19"/>
         </w:rPr>
-        <w:t xml:space="preserve"> in Meta and TikTok advertising for a personal financing product, generating </w:t>
+        <w:t xml:space="preserve"> in Meta and TikTok advertising for a personal financing product. Campaigns contributed to </w:t>
       </w:r>
       <w:r>
         <w:rPr>
@@ -573,6 +547,72 @@
           <w:color w:val="12212E"/>
           <w:sz w:val="19"/>
         </w:rPr>
+        <w:t xml:space="preserve">Audited </w:t>
+      </w:r>
+      <w:r>
+        <w:rPr>
+          <w:rFonts w:ascii="Calibri" w:hAnsi="Calibri" w:eastAsia="Calibri" w:cs="Calibri"/>
+          <w:b/>
+          <w:i w:val="0"/>
+          <w:color w:val="12212E"/>
+          <w:sz w:val="19"/>
+        </w:rPr>
+        <w:t>272</w:t>
+      </w:r>
+      <w:r>
+        <w:rPr>
+          <w:rFonts w:ascii="Calibri" w:hAnsi="Calibri" w:eastAsia="Calibri" w:cs="Calibri"/>
+          <w:b w:val="0"/>
+          <w:i w:val="0"/>
+          <w:color w:val="12212E"/>
+          <w:sz w:val="19"/>
+        </w:rPr>
+        <w:t xml:space="preserve"> application records and identified a spreadsheet calculation issue that understated December results by approximately </w:t>
+      </w:r>
+      <w:r>
+        <w:rPr>
+          <w:rFonts w:ascii="Calibri" w:hAnsi="Calibri" w:eastAsia="Calibri" w:cs="Calibri"/>
+          <w:b/>
+          <w:i w:val="0"/>
+          <w:color w:val="12212E"/>
+          <w:sz w:val="19"/>
+        </w:rPr>
+        <w:t>RM767,100</w:t>
+      </w:r>
+      <w:r>
+        <w:rPr>
+          <w:rFonts w:ascii="Calibri" w:hAnsi="Calibri" w:eastAsia="Calibri" w:cs="Calibri"/>
+          <w:b w:val="0"/>
+          <w:i w:val="0"/>
+          <w:color w:val="12212E"/>
+          <w:sz w:val="19"/>
+        </w:rPr>
+        <w:t>.</w:t>
+      </w:r>
+    </w:p>
+    <w:p>
+      <w:pPr>
+        <w:spacing w:before="0" w:after="24" w:line="240" w:lineRule="auto"/>
+        <w:ind w:left="283" w:hanging="181"/>
+      </w:pPr>
+      <w:r>
+        <w:rPr>
+          <w:rFonts w:ascii="Calibri" w:hAnsi="Calibri" w:eastAsia="Calibri" w:cs="Calibri"/>
+          <w:b w:val="0"/>
+          <w:i w:val="0"/>
+          <w:color w:val="12212E"/>
+          <w:sz w:val="19"/>
+        </w:rPr>
+        <w:t xml:space="preserve">• </w:t>
+      </w:r>
+      <w:r>
+        <w:rPr>
+          <w:rFonts w:ascii="Calibri" w:hAnsi="Calibri" w:eastAsia="Calibri" w:cs="Calibri"/>
+          <w:b w:val="0"/>
+          <w:i w:val="0"/>
+          <w:color w:val="12212E"/>
+          <w:sz w:val="19"/>
+        </w:rPr>
         <w:t>Built campaign audiences and creative for lead generation, running campaigns independently from setup through to review.</w:t>
       </w:r>
     </w:p>
@@ -599,7 +639,7 @@
           <w:color w:val="12212E"/>
           <w:sz w:val="19"/>
         </w:rPr>
-        <w:t>Tracked performance against sales and disbursement results rather than vanity metrics.</w:t>
+        <w:t>Tracked campaign performance against application, loan and disbursement outcomes.</w:t>
       </w:r>
     </w:p>
     <w:p>
@@ -872,32 +912,6 @@
     </w:p>
     <w:p>
       <w:pPr>
-        <w:spacing w:before="0" w:after="24" w:line="240" w:lineRule="auto"/>
-        <w:ind w:left="283" w:hanging="181"/>
-      </w:pPr>
-      <w:r>
-        <w:rPr>
-          <w:rFonts w:ascii="Calibri" w:hAnsi="Calibri" w:eastAsia="Calibri" w:cs="Calibri"/>
-          <w:b w:val="0"/>
-          <w:i w:val="0"/>
-          <w:color w:val="12212E"/>
-          <w:sz w:val="19"/>
-        </w:rPr>
-        <w:t xml:space="preserve">• </w:t>
-      </w:r>
-      <w:r>
-        <w:rPr>
-          <w:rFonts w:ascii="Calibri" w:hAnsi="Calibri" w:eastAsia="Calibri" w:cs="Calibri"/>
-          <w:b w:val="0"/>
-          <w:i w:val="0"/>
-          <w:color w:val="12212E"/>
-          <w:sz w:val="19"/>
-        </w:rPr>
-        <w:t>Managed content across the company website and social media channels.</w:t>
-      </w:r>
-    </w:p>
-    <w:p>
-      <w:pPr>
         <w:spacing w:before="120" w:after="60" w:line="240" w:lineRule="auto"/>
         <w:pBdr>
           <w:bottom w:val="single" w:sz="8" w:space="1" w:color="1B4F86"/>
@@ -936,7 +950,7 @@
           <w:color w:val="12212E"/>
           <w:sz w:val="19"/>
         </w:rPr>
-        <w:t>Meta Ads, TikTok Ads, Lead Generation, Performance Marketing, Paid Advertising, Campaign Planning, Audience Targeting, Customer Acquisition, Social Media Marketing, Content Strategy</w:t>
+        <w:t>Meta Ads, TikTok Ads, Lead Generation, Performance Marketing, Paid Advertising, Campaign Planning, Audience Targeting, Customer Acquisition, Social Media Marketing, Content Strategy, AI-Assisted Content Creation</w:t>
       </w:r>
     </w:p>
     <w:p>
@@ -951,7 +965,7 @@
           <w:color w:val="12212E"/>
           <w:sz w:val="19"/>
         </w:rPr>
-        <w:t xml:space="preserve">Google / Search: </w:t>
+        <w:t xml:space="preserve">Marketing Analytics: </w:t>
       </w:r>
       <w:r>
         <w:rPr>
@@ -961,7 +975,7 @@
           <w:color w:val="12212E"/>
           <w:sz w:val="19"/>
         </w:rPr>
-        <w:t>Google Ads, SEM, SEO (currently developing)</w:t>
+        <w:t>Excel, Campaign Reporting, KPI Tracking, Performance Analysis, Data Auditing</w:t>
       </w:r>
     </w:p>
     <w:p>
@@ -986,7 +1000,7 @@
           <w:color w:val="12212E"/>
           <w:sz w:val="19"/>
         </w:rPr>
-        <w:t>Landing Page Design, Front-End Builds, WordPress, Conversion Optimization, Customer Journey Design, Digital Workflows</w:t>
+        <w:t>Front-End Builds, Landing Page Design, WordPress, Conversion Optimization, Customer Journey Design, Figma, Canva</w:t>
       </w:r>
     </w:p>
     <w:p>
@@ -1001,7 +1015,7 @@
           <w:color w:val="12212E"/>
           <w:sz w:val="19"/>
         </w:rPr>
-        <w:t xml:space="preserve">Analytics: </w:t>
+        <w:t xml:space="preserve">Google &amp; Search: </w:t>
       </w:r>
       <w:r>
         <w:rPr>
@@ -1011,7 +1025,7 @@
           <w:color w:val="12212E"/>
           <w:sz w:val="19"/>
         </w:rPr>
-        <w:t>Excel, Campaign Reporting, KPI Tracking</w:t>
+        <w:t>Google Ads, SEM, SEO (currently developing)</w:t>
       </w:r>
     </w:p>
     <w:p>
@@ -1037,31 +1051,6 @@
           <w:sz w:val="19"/>
         </w:rPr>
         <w:t>GA4, Power BI, Python, SQL</w:t>
-      </w:r>
-    </w:p>
-    <w:p>
-      <w:pPr>
-        <w:spacing w:before="0" w:after="24" w:line="240" w:lineRule="auto"/>
-      </w:pPr>
-      <w:r>
-        <w:rPr>
-          <w:rFonts w:ascii="Calibri" w:hAnsi="Calibri" w:eastAsia="Calibri" w:cs="Calibri"/>
-          <w:b/>
-          <w:i w:val="0"/>
-          <w:color w:val="12212E"/>
-          <w:sz w:val="19"/>
-        </w:rPr>
-        <w:t xml:space="preserve">AI &amp; Design: </w:t>
-      </w:r>
-      <w:r>
-        <w:rPr>
-          <w:rFonts w:ascii="Calibri" w:hAnsi="Calibri" w:eastAsia="Calibri" w:cs="Calibri"/>
-          <w:b w:val="0"/>
-          <w:i w:val="0"/>
-          <w:color w:val="12212E"/>
-          <w:sz w:val="19"/>
-        </w:rPr>
-        <w:t>AI-Assisted Content Creation, Workflow Optimization, Canva, CapCut, Figma</w:t>
       </w:r>
     </w:p>
     <w:p>

</xml_diff>

<commit_message>
Skills: balance the wrap so no category orphans a second line
Web and Conversion now fits one line, so Digital Marketing carries the
design tools (Figma, Canva) and drops the redundant Paid Advertising
entry, which duplicated Performance Marketing and the platform names.
Recovers one full line: slack 9.5mm to 13.8mm.
</commit_message>
<xml_diff>
--- a/assets/Muhd-Hassan-Resume.docx
+++ b/assets/Muhd-Hassan-Resume.docx
@@ -950,7 +950,7 @@
           <w:color w:val="12212E"/>
           <w:sz w:val="19"/>
         </w:rPr>
-        <w:t>Meta Ads, TikTok Ads, Lead Generation, Performance Marketing, Paid Advertising, Campaign Planning, Audience Targeting, Customer Acquisition, Social Media Marketing, Content Strategy, AI-Assisted Content Creation</w:t>
+        <w:t>Meta Ads, TikTok Ads, Lead Generation, Performance Marketing, Campaign Planning, Audience Targeting, Customer Acquisition, Social Media Marketing, Content Strategy, AI-Assisted Content Creation, Figma, Canva</w:t>
       </w:r>
     </w:p>
     <w:p>
@@ -1000,7 +1000,7 @@
           <w:color w:val="12212E"/>
           <w:sz w:val="19"/>
         </w:rPr>
-        <w:t>Front-End Builds, Landing Page Design, WordPress, Conversion Optimization, Customer Journey Design, Figma, Canva</w:t>
+        <w:t>Front-End Builds, Landing Page Design, WordPress, Conversion Optimization, Customer Journey Design</w:t>
       </w:r>
     </w:p>
     <w:p>

</xml_diff>

<commit_message>
Withdraw the Xanderia audit claim at the owner's request
The record audit and the RM767,100 understatement read too close to an
assurance claim, so both come off the resume and out of the portfolio.

Resume: drop the 272 record audit bullet and the Data Auditing skill that
leaned on it. Slack rises to 22.6mm.

Portfolio: reword the intro and case summary, remove the Audit content
block, and relabel the five charts and their lightboxes as campaign data
from the client's own records. Charts and the case study PDF are kept.
The SWR portal feature reads activity history rather than audit trail.

The verifier now forbids Audited, RM767,100 and Data Auditing so the claim
cannot return through a later copy edit.
</commit_message>
<xml_diff>
--- a/assets/Muhd-Hassan-Resume.docx
+++ b/assets/Muhd-Hassan-Resume.docx
@@ -547,72 +547,6 @@
           <w:color w:val="12212E"/>
           <w:sz w:val="19"/>
         </w:rPr>
-        <w:t xml:space="preserve">Audited </w:t>
-      </w:r>
-      <w:r>
-        <w:rPr>
-          <w:rFonts w:ascii="Calibri" w:hAnsi="Calibri" w:eastAsia="Calibri" w:cs="Calibri"/>
-          <w:b/>
-          <w:i w:val="0"/>
-          <w:color w:val="12212E"/>
-          <w:sz w:val="19"/>
-        </w:rPr>
-        <w:t>272</w:t>
-      </w:r>
-      <w:r>
-        <w:rPr>
-          <w:rFonts w:ascii="Calibri" w:hAnsi="Calibri" w:eastAsia="Calibri" w:cs="Calibri"/>
-          <w:b w:val="0"/>
-          <w:i w:val="0"/>
-          <w:color w:val="12212E"/>
-          <w:sz w:val="19"/>
-        </w:rPr>
-        <w:t xml:space="preserve"> application records and identified a spreadsheet calculation issue that understated December results by approximately </w:t>
-      </w:r>
-      <w:r>
-        <w:rPr>
-          <w:rFonts w:ascii="Calibri" w:hAnsi="Calibri" w:eastAsia="Calibri" w:cs="Calibri"/>
-          <w:b/>
-          <w:i w:val="0"/>
-          <w:color w:val="12212E"/>
-          <w:sz w:val="19"/>
-        </w:rPr>
-        <w:t>RM767,100</w:t>
-      </w:r>
-      <w:r>
-        <w:rPr>
-          <w:rFonts w:ascii="Calibri" w:hAnsi="Calibri" w:eastAsia="Calibri" w:cs="Calibri"/>
-          <w:b w:val="0"/>
-          <w:i w:val="0"/>
-          <w:color w:val="12212E"/>
-          <w:sz w:val="19"/>
-        </w:rPr>
-        <w:t>.</w:t>
-      </w:r>
-    </w:p>
-    <w:p>
-      <w:pPr>
-        <w:spacing w:before="0" w:after="24" w:line="240" w:lineRule="auto"/>
-        <w:ind w:left="283" w:hanging="181"/>
-      </w:pPr>
-      <w:r>
-        <w:rPr>
-          <w:rFonts w:ascii="Calibri" w:hAnsi="Calibri" w:eastAsia="Calibri" w:cs="Calibri"/>
-          <w:b w:val="0"/>
-          <w:i w:val="0"/>
-          <w:color w:val="12212E"/>
-          <w:sz w:val="19"/>
-        </w:rPr>
-        <w:t xml:space="preserve">• </w:t>
-      </w:r>
-      <w:r>
-        <w:rPr>
-          <w:rFonts w:ascii="Calibri" w:hAnsi="Calibri" w:eastAsia="Calibri" w:cs="Calibri"/>
-          <w:b w:val="0"/>
-          <w:i w:val="0"/>
-          <w:color w:val="12212E"/>
-          <w:sz w:val="19"/>
-        </w:rPr>
         <w:t>Built campaign audiences and creative for lead generation, running campaigns independently from setup through to review.</w:t>
       </w:r>
     </w:p>
@@ -975,7 +909,7 @@
           <w:color w:val="12212E"/>
           <w:sz w:val="19"/>
         </w:rPr>
-        <w:t>Excel, Campaign Reporting, KPI Tracking, Performance Analysis, Data Auditing</w:t>
+        <w:t>Excel, Campaign Reporting, KPI Tracking, Performance Analysis</w:t>
       </w:r>
     </w:p>
     <w:p>

</xml_diff>